<commit_message>
Unit 3 Day 1: add animated pixel-art figures (Democritus, Lavoisier, Proust, Dalton, gold atoms, peroxide) and portraits on the sheet
Co-Authored-By: Claude Sonnet 5.5 <noreply@anthropic.com>
Claude-Session: https://claude.ai/code/session_0149Y8BukWKUrM69ZxPpnpte
</commit_message>
<xml_diff>
--- a/chemistry/unit-3-atoms-ions/atom-discovery-sheet.docx
+++ b/chemistry/unit-3-atoms-ions/atom-discovery-sheet.docx
@@ -1805,7 +1805,7 @@
       <w:tr>
         <w:trPr>
           <w:cantSplit/>
-          <w:trHeight w:val="520" w:hRule="atLeast"/>
+          <w:trHeight w:val="1100" w:hRule="atLeast"/>
         </w:trPr>
         <w:tc>
           <w:tcPr>
@@ -1837,6 +1837,51 @@
                 <w:szCs w:val="19"/>
               </w:rPr>
               <w:t xml:space="preserve">Democritus (≈400 BCE)</w:t>
+            </w:r>
+          </w:p>
+          <w:p>
+            <w:pPr>
+              <w:spacing w:after="0"/>
+            </w:pPr>
+            <w:r>
+              <w:drawing>
+                <wp:inline distT="0" distB="0" distL="0" distR="0">
+                  <wp:extent cx="514350" cy="628650"/>
+                  <wp:effectExtent t="0" r="0" b="0" l="0"/>
+                  <wp:docPr id="1" name="Pixel-art painting of Democritus laughing" descr="Pixel-art painting of Democritus laughing" title="Pixel-art painting of Democritus laughing"/>
+                  <wp:cNvGraphicFramePr>
+                    <a:graphicFrameLocks xmlns:a="http://schemas.openxmlformats.org/drawingml/2006/main" noChangeAspect="1"/>
+                  </wp:cNvGraphicFramePr>
+                  <a:graphic xmlns:a="http://schemas.openxmlformats.org/drawingml/2006/main">
+                    <a:graphicData uri="http://schemas.openxmlformats.org/drawingml/2006/picture">
+                      <pic:pic xmlns:pic="http://schemas.openxmlformats.org/drawingml/2006/picture">
+                        <pic:nvPicPr>
+                          <pic:cNvPr id="0" name="" descr=""/>
+                          <pic:cNvPicPr>
+                            <a:picLocks noChangeAspect="1" noChangeArrowheads="1"/>
+                          </pic:cNvPicPr>
+                        </pic:nvPicPr>
+                        <pic:blipFill>
+                          <a:blip r:embed="rId8" cstate="none"/>
+                          <a:srcRect/>
+                          <a:stretch>
+                            <a:fillRect/>
+                          </a:stretch>
+                        </pic:blipFill>
+                        <pic:spPr bwMode="auto">
+                          <a:xfrm>
+                            <a:off x="0" y="0"/>
+                            <a:ext cx="514350" cy="628650"/>
+                          </a:xfrm>
+                          <a:prstGeom prst="rect">
+                            <a:avLst/>
+                          </a:prstGeom>
+                        </pic:spPr>
+                      </pic:pic>
+                    </a:graphicData>
+                  </a:graphic>
+                </wp:inline>
+              </w:drawing>
             </w:r>
           </w:p>
         </w:tc>
@@ -1910,7 +1955,7 @@
       <w:tr>
         <w:trPr>
           <w:cantSplit/>
-          <w:trHeight w:val="520" w:hRule="atLeast"/>
+          <w:trHeight w:val="1100" w:hRule="atLeast"/>
         </w:trPr>
         <w:tc>
           <w:tcPr>
@@ -1942,6 +1987,51 @@
                 <w:szCs w:val="19"/>
               </w:rPr>
               <w:t xml:space="preserve">Dalton (1803)</w:t>
+            </w:r>
+          </w:p>
+          <w:p>
+            <w:pPr>
+              <w:spacing w:after="0"/>
+            </w:pPr>
+            <w:r>
+              <w:drawing>
+                <wp:inline distT="0" distB="0" distL="0" distR="0">
+                  <wp:extent cx="514350" cy="628650"/>
+                  <wp:effectExtent t="0" r="0" b="0" l="0"/>
+                  <wp:docPr id="1" name="Pixel-art portrait of John Dalton" descr="Pixel-art portrait of John Dalton" title="Pixel-art portrait of John Dalton"/>
+                  <wp:cNvGraphicFramePr>
+                    <a:graphicFrameLocks xmlns:a="http://schemas.openxmlformats.org/drawingml/2006/main" noChangeAspect="1"/>
+                  </wp:cNvGraphicFramePr>
+                  <a:graphic xmlns:a="http://schemas.openxmlformats.org/drawingml/2006/main">
+                    <a:graphicData uri="http://schemas.openxmlformats.org/drawingml/2006/picture">
+                      <pic:pic xmlns:pic="http://schemas.openxmlformats.org/drawingml/2006/picture">
+                        <pic:nvPicPr>
+                          <pic:cNvPr id="0" name="" descr=""/>
+                          <pic:cNvPicPr>
+                            <a:picLocks noChangeAspect="1" noChangeArrowheads="1"/>
+                          </pic:cNvPicPr>
+                        </pic:nvPicPr>
+                        <pic:blipFill>
+                          <a:blip r:embed="rId9" cstate="none"/>
+                          <a:srcRect/>
+                          <a:stretch>
+                            <a:fillRect/>
+                          </a:stretch>
+                        </pic:blipFill>
+                        <pic:spPr bwMode="auto">
+                          <a:xfrm>
+                            <a:off x="0" y="0"/>
+                            <a:ext cx="514350" cy="628650"/>
+                          </a:xfrm>
+                          <a:prstGeom prst="rect">
+                            <a:avLst/>
+                          </a:prstGeom>
+                        </pic:spPr>
+                      </pic:pic>
+                    </a:graphicData>
+                  </a:graphic>
+                </wp:inline>
+              </w:drawing>
             </w:r>
           </w:p>
         </w:tc>

</xml_diff>